<commit_message>
final draft of project proposal
</commit_message>
<xml_diff>
--- a/docs/Project_proposal/Project_proposal.docx
+++ b/docs/Project_proposal/Project_proposal.docx
@@ -91,7 +91,11 @@
           <w:tcPr>
             <w:tcW w:w="1169" w:type="dxa"/>
           </w:tcPr>
-          <w:p/>
+          <w:p>
+            <w:r>
+              <w:t>35195717</w:t>
+            </w:r>
+          </w:p>
         </w:tc>
       </w:tr>
       <w:tr>
@@ -145,216 +149,229 @@
     </w:p>
     <w:p>
       <w:r>
-        <w:t xml:space="preserve">Most robotic manipulators are still programmed through explicit trajectories or task-specific scripts. </w:t>
-      </w:r>
-      <w:proofErr w:type="gramStart"/>
-      <w:r>
-        <w:t>Humans</w:t>
-      </w:r>
-      <w:proofErr w:type="gramEnd"/>
+        <w:t xml:space="preserve">Most robotic manipulators are still programmed through explicit trajectories or task-specific scripts. Humans </w:t>
+      </w:r>
+      <w:r>
+        <w:t>communication is more like</w:t>
+      </w:r>
+      <w:r>
+        <w:t xml:space="preserve"> "move the red bottle to the left side of the table" and expect the intent to be </w:t>
+      </w:r>
+      <w:r>
+        <w:t>understood</w:t>
+      </w:r>
+      <w:r>
+        <w:t xml:space="preserve">. </w:t>
+      </w:r>
+    </w:p>
+    <w:p>
+      <w:r>
+        <w:t>Vision-Language-Action (VLA) models close this gap by mapping raw camera input and a natural-language instruction directly to low-level robot actions, removing the need for hand-engineered perception and planning pipelines for each new task. The catch is size. State-of-the-art open VLA models like OpenVLA run at 7B parameters, built on a vision encoder plus an LLM backbone. That's roughly 14GB in bf16 before accounting for activations and KV cache, well beyond what fits on many of the embedded or single-GPU systems actually mounted on a manipulator. If VLAs are going to move from research demos to real deployed robots, they need to run under realistic memory budgets without giving up the instruction-following behaviour that makes them useful in the first place.</w:t>
+      </w:r>
+    </w:p>
+    <w:p>
+      <w:r>
+        <w:t>2</w:t>
+      </w:r>
+      <w:r>
+        <w:t xml:space="preserve">. </w:t>
+      </w:r>
+      <w:r>
+        <w:t>Design Goals</w:t>
+      </w:r>
+    </w:p>
+    <w:p>
+      <w:pPr>
+        <w:pStyle w:val="ListParagraph"/>
+        <w:numPr>
+          <w:ilvl w:val="0"/>
+          <w:numId w:val="1"/>
+        </w:numPr>
+      </w:pPr>
+      <w:r>
+        <w:t>Understand</w:t>
+      </w:r>
+      <w:r>
+        <w:t>ing</w:t>
+      </w:r>
+      <w:r>
+        <w:t xml:space="preserve"> the VLA architecture end-to-end vision encoding, language</w:t>
+      </w:r>
       <w:r>
         <w:t xml:space="preserve"> </w:t>
       </w:r>
       <w:r>
-        <w:t>communication is more like</w:t>
-      </w:r>
-      <w:r>
-        <w:t xml:space="preserve"> "move the red bottle to the left side of the table" and expect the intent to be </w:t>
-      </w:r>
-      <w:r>
-        <w:t>understood</w:t>
+        <w:t>conditioning, and the action tokenization/decoding scheme</w:t>
+      </w:r>
+      <w:r>
+        <w:t xml:space="preserve"> to perform safe compression.</w:t>
+      </w:r>
+    </w:p>
+    <w:p>
+      <w:pPr>
+        <w:pStyle w:val="ListParagraph"/>
+        <w:numPr>
+          <w:ilvl w:val="0"/>
+          <w:numId w:val="1"/>
+        </w:numPr>
+      </w:pPr>
+      <w:r>
+        <w:t>Fit</w:t>
+      </w:r>
+      <w:r>
+        <w:t>ting</w:t>
+      </w:r>
+      <w:r>
+        <w:t xml:space="preserve"> the model in 16GB at inference time, including activations</w:t>
+      </w:r>
+      <w:r>
+        <w:t>,</w:t>
+      </w:r>
+      <w:r>
+        <w:t xml:space="preserve"> static weights</w:t>
+      </w:r>
+      <w:r>
+        <w:t xml:space="preserve"> and keeping</w:t>
+      </w:r>
+      <w:r>
+        <w:t xml:space="preserve"> </w:t>
+      </w:r>
+      <w:r>
+        <w:t>acceptable</w:t>
+      </w:r>
+      <w:r>
+        <w:t xml:space="preserve"> accuracy</w:t>
+      </w:r>
+      <w:r>
+        <w:t>.</w:t>
+      </w:r>
+    </w:p>
+    <w:p>
+      <w:pPr>
+        <w:pStyle w:val="ListParagraph"/>
+        <w:numPr>
+          <w:ilvl w:val="0"/>
+          <w:numId w:val="1"/>
+        </w:numPr>
+      </w:pPr>
+      <w:r>
+        <w:t xml:space="preserve">Closing </w:t>
+      </w:r>
+      <w:r>
+        <w:t xml:space="preserve"> the loop in simulation language</w:t>
+      </w:r>
+      <w:r>
+        <w:t xml:space="preserve"> with</w:t>
+      </w:r>
+      <w:r>
+        <w:t xml:space="preserve"> instruction in, manipulator trajectory out, task</w:t>
+      </w:r>
+      <w:r>
+        <w:t xml:space="preserve"> </w:t>
+      </w:r>
+      <w:r>
+        <w:t xml:space="preserve">success or failure observed </w:t>
+      </w:r>
+    </w:p>
+    <w:p>
+      <w:pPr>
+        <w:pStyle w:val="ListParagraph"/>
+        <w:numPr>
+          <w:ilvl w:val="0"/>
+          <w:numId w:val="1"/>
+        </w:numPr>
+      </w:pPr>
+      <w:r>
+        <w:t>Quantify</w:t>
+      </w:r>
+      <w:r>
+        <w:t>ing</w:t>
+      </w:r>
+      <w:r>
+        <w:t xml:space="preserve"> the compression trade-off</w:t>
+      </w:r>
+      <w:r>
+        <w:t xml:space="preserve"> with</w:t>
+      </w:r>
+      <w:r>
+        <w:t xml:space="preserve"> report memory, inference latency, an</w:t>
+      </w:r>
+      <w:r>
+        <w:t xml:space="preserve">d </w:t>
+      </w:r>
+      <w:r>
+        <w:t>task success together.</w:t>
+      </w:r>
+    </w:p>
+    <w:p/>
+    <w:p>
+      <w:r>
+        <w:t>3</w:t>
       </w:r>
       <w:r>
         <w:t xml:space="preserve">. </w:t>
       </w:r>
-    </w:p>
-    <w:p>
-      <w:r>
-        <w:t xml:space="preserve">Vision-Language-Action (VLA) models close this gap by mapping raw camera input and a natural-language instruction directly to low-level robot actions, removing the need for hand-engineered perception and planning pipelines for each new task. The catch is size. State-of-the-art open VLA models like </w:t>
-      </w:r>
-      <w:proofErr w:type="spellStart"/>
-      <w:r>
-        <w:t>OpenVLA</w:t>
-      </w:r>
-      <w:proofErr w:type="spellEnd"/>
-      <w:r>
-        <w:t xml:space="preserve"> run at 7B parameters, built on a vision encoder plus an LLM backbone. That's roughly 14GB in bf16 before accounting for activations and KV cache, well beyond what fits on many of the embedded or single-GPU systems </w:t>
-      </w:r>
-      <w:proofErr w:type="gramStart"/>
-      <w:r>
-        <w:t>actually mounted</w:t>
-      </w:r>
-      <w:proofErr w:type="gramEnd"/>
-      <w:r>
-        <w:t xml:space="preserve"> on a manipulator. If VLAs are going to move from research demos to real deployed robots, they need to run under realistic memory budgets without giving up the instruction-following behaviour that makes them useful in the first place.</w:t>
-      </w:r>
-    </w:p>
-    <w:p>
-      <w:r>
-        <w:t>2</w:t>
-      </w:r>
-      <w:r>
-        <w:t xml:space="preserve">. </w:t>
-      </w:r>
-      <w:r>
-        <w:t>Design Goals</w:t>
-      </w:r>
-    </w:p>
-    <w:p>
-      <w:r>
-        <w:t>Understand</w:t>
-      </w:r>
-      <w:r>
-        <w:t>ing</w:t>
-      </w:r>
-      <w:r>
-        <w:t xml:space="preserve"> the VLA architecture end-to-end vision encoding, language</w:t>
+      <w:r>
+        <w:t>Deliverables</w:t>
+      </w:r>
+    </w:p>
+    <w:p>
+      <w:pPr>
+        <w:pStyle w:val="ListParagraph"/>
+        <w:numPr>
+          <w:ilvl w:val="0"/>
+          <w:numId w:val="2"/>
+        </w:numPr>
+      </w:pPr>
+      <w:r>
+        <w:t>Compressed model. The 7B VLA model reduced to run within a 160B memory envelope,</w:t>
       </w:r>
       <w:r>
         <w:t xml:space="preserve"> </w:t>
       </w:r>
       <w:r>
-        <w:t>conditioning, and the action tokenization/decoding scheme</w:t>
-      </w:r>
-      <w:r>
-        <w:t xml:space="preserve"> to perform safe compression.</w:t>
-      </w:r>
-    </w:p>
-    <w:p>
-      <w:r>
-        <w:t>Fit</w:t>
-      </w:r>
-      <w:r>
-        <w:t>ting</w:t>
-      </w:r>
-      <w:r>
-        <w:t xml:space="preserve"> the model in 16GB at inference time, including activations</w:t>
-      </w:r>
-      <w:r>
-        <w:t>,</w:t>
-      </w:r>
-      <w:r>
-        <w:t xml:space="preserve"> static weights</w:t>
-      </w:r>
-      <w:r>
-        <w:t xml:space="preserve"> and keeping</w:t>
+        <w:t xml:space="preserve">through quantization and/or pruning/distillation, with accuracy, </w:t>
+      </w:r>
+      <w:r>
+        <w:lastRenderedPageBreak/>
+        <w:t>memory, and latency</w:t>
       </w:r>
       <w:r>
         <w:t xml:space="preserve"> </w:t>
       </w:r>
       <w:r>
-        <w:t>acceptable</w:t>
-      </w:r>
-      <w:r>
-        <w:t xml:space="preserve"> accuracy</w:t>
-      </w:r>
-      <w:r>
-        <w:t>.</w:t>
-      </w:r>
-    </w:p>
-    <w:p>
-      <w:proofErr w:type="gramStart"/>
-      <w:r>
-        <w:t xml:space="preserve">Closing </w:t>
-      </w:r>
-      <w:r>
-        <w:t xml:space="preserve"> the</w:t>
-      </w:r>
-      <w:proofErr w:type="gramEnd"/>
-      <w:r>
-        <w:t xml:space="preserve"> loop in simulation language</w:t>
-      </w:r>
-      <w:r>
-        <w:t xml:space="preserve"> with</w:t>
-      </w:r>
-      <w:r>
-        <w:t xml:space="preserve"> instruction in, manipulator trajectory out, task</w:t>
+        <w:t>benchmarked against the uncompressed baseline.</w:t>
+      </w:r>
+      <w:r>
+        <w:t xml:space="preserve"> As a contingency plan we might use </w:t>
+      </w:r>
+      <w:r>
+        <w:t>LLaVA-VLA</w:t>
+      </w:r>
+      <w:r>
+        <w:t xml:space="preserve"> directly</w:t>
+      </w:r>
+    </w:p>
+    <w:p>
+      <w:pPr>
+        <w:pStyle w:val="ListParagraph"/>
+        <w:numPr>
+          <w:ilvl w:val="0"/>
+          <w:numId w:val="2"/>
+        </w:numPr>
+      </w:pPr>
+      <w:r>
+        <w:t>Simulated pick-and-place system. A pick-and-place environment built in a robotic</w:t>
       </w:r>
       <w:r>
         <w:t xml:space="preserve"> </w:t>
       </w:r>
       <w:r>
-        <w:t xml:space="preserve">success or failure observed </w:t>
-      </w:r>
-    </w:p>
-    <w:p>
-      <w:r>
-        <w:t>Quantify</w:t>
-      </w:r>
-      <w:r>
-        <w:t>ing</w:t>
-      </w:r>
-      <w:r>
-        <w:t xml:space="preserve"> the compression trade-off</w:t>
-      </w:r>
-      <w:r>
-        <w:t xml:space="preserve"> with</w:t>
-      </w:r>
-      <w:r>
-        <w:t xml:space="preserve"> report memory, inference latency, an</w:t>
-      </w:r>
-      <w:r>
-        <w:t xml:space="preserve">d </w:t>
-      </w:r>
-      <w:r>
-        <w:t>task success together.</w:t>
-      </w:r>
-    </w:p>
-    <w:p/>
-    <w:p>
-      <w:r>
-        <w:t>3</w:t>
-      </w:r>
-      <w:r>
-        <w:t xml:space="preserve">. </w:t>
-      </w:r>
-      <w:r>
-        <w:t>Deliverables</w:t>
-      </w:r>
-    </w:p>
-    <w:p>
-      <w:r>
-        <w:t xml:space="preserve"> Compressed model. The 7B VLA model reduced to run within a 160B memory envelope,</w:t>
+        <w:t>simulator, with the compressed VLA integrated into the control loop and evaluated on</w:t>
       </w:r>
       <w:r>
         <w:t xml:space="preserve"> </w:t>
       </w:r>
-      <w:r>
-        <w:t>through quantization and/or pruning/distillation, with accuracy, memory, and latency</w:t>
-      </w:r>
-      <w:r>
-        <w:t xml:space="preserve"> </w:t>
-      </w:r>
-      <w:r>
-        <w:lastRenderedPageBreak/>
-        <w:t>benchmarked against the uncompressed baseline.</w:t>
-      </w:r>
-      <w:r>
-        <w:t xml:space="preserve"> As a contingency plan we might use </w:t>
-      </w:r>
-      <w:proofErr w:type="spellStart"/>
-      <w:r>
-        <w:t>LLaVA</w:t>
-      </w:r>
-      <w:proofErr w:type="spellEnd"/>
-      <w:r>
-        <w:t>-VLA</w:t>
-      </w:r>
-      <w:r>
-        <w:t xml:space="preserve"> directly</w:t>
-      </w:r>
-    </w:p>
-    <w:p>
-      <w:r>
-        <w:t>Simulated pick-and-place system. A pick-and-place environment built in a robotic</w:t>
-      </w:r>
-    </w:p>
-    <w:p>
-      <w:r>
-        <w:t>simulator, with the compressed VLA integrated into the control loop and evaluated on</w:t>
-      </w:r>
-    </w:p>
-    <w:p>
       <w:r>
         <w:t>language-conditioned manipulation tasks.</w:t>
       </w:r>
@@ -404,7 +421,7 @@
                     <pic:cNvPicPr/>
                   </pic:nvPicPr>
                   <pic:blipFill rotWithShape="1">
-                    <a:blip r:embed="rId4"/>
+                    <a:blip r:embed="rId5"/>
                     <a:srcRect l="1169" r="1"/>
                     <a:stretch>
                       <a:fillRect/>
@@ -455,7 +472,7 @@
                     <pic:cNvPicPr/>
                   </pic:nvPicPr>
                   <pic:blipFill>
-                    <a:blip r:embed="rId5"/>
+                    <a:blip r:embed="rId6"/>
                     <a:stretch>
                       <a:fillRect/>
                     </a:stretch>
@@ -479,46 +496,30 @@
     <w:p/>
     <w:p>
       <w:r>
+        <w:t>5</w:t>
+      </w:r>
+      <w:r>
+        <w:t xml:space="preserve">. </w:t>
+      </w:r>
+      <w:r>
+        <w:t xml:space="preserve"> Hardware / Software Requirements Hardware </w:t>
+      </w:r>
+    </w:p>
+    <w:p>
+      <w:r>
         <w:lastRenderedPageBreak/>
-        <w:t>5</w:t>
-      </w:r>
-      <w:r>
-        <w:t xml:space="preserve">. </w:t>
-      </w:r>
-      <w:r>
-        <w:t xml:space="preserve"> Hardware / Software Requirements Hardware </w:t>
-      </w:r>
-    </w:p>
-    <w:p>
-      <w:r>
-        <w:t xml:space="preserve">• GPU with 16GB VRAM </w:t>
-      </w:r>
-      <w:proofErr w:type="gramStart"/>
-      <w:r>
-        <w:t xml:space="preserve">for </w:t>
+        <w:t xml:space="preserve">• GPU with 16GB VRAM for </w:t>
       </w:r>
       <w:r>
         <w:t xml:space="preserve"> </w:t>
       </w:r>
       <w:r>
-        <w:t>compression</w:t>
-      </w:r>
-      <w:proofErr w:type="gramEnd"/>
-      <w:r>
-        <w:t xml:space="preserve"> experiments</w:t>
-      </w:r>
-    </w:p>
-    <w:p>
-      <w:r>
-        <w:t xml:space="preserve"> • Workstation capable </w:t>
-      </w:r>
-      <w:proofErr w:type="gramStart"/>
-      <w:r>
-        <w:t>Of</w:t>
-      </w:r>
-      <w:proofErr w:type="gramEnd"/>
-      <w:r>
-        <w:t xml:space="preserve"> running Isaac Sim (check NVIDIA's system requirements) </w:t>
+        <w:t>compression experiments</w:t>
+      </w:r>
+    </w:p>
+    <w:p>
+      <w:r>
+        <w:t xml:space="preserve"> • Workstation capable Of running Isaac Sim (check NVIDIA's system requirements) </w:t>
       </w:r>
     </w:p>
     <w:p>
@@ -528,70 +529,22 @@
     </w:p>
     <w:p>
       <w:r>
-        <w:t xml:space="preserve">• Python, </w:t>
-      </w:r>
-      <w:proofErr w:type="spellStart"/>
-      <w:r>
-        <w:t>PyTorch</w:t>
-      </w:r>
-      <w:proofErr w:type="spellEnd"/>
-      <w:r>
-        <w:t xml:space="preserve">, Hugging Face Transformers </w:t>
-      </w:r>
-    </w:p>
-    <w:p>
-      <w:r>
-        <w:t xml:space="preserve">• </w:t>
-      </w:r>
-      <w:proofErr w:type="spellStart"/>
-      <w:r>
-        <w:t>OpenVLA</w:t>
-      </w:r>
-      <w:proofErr w:type="spellEnd"/>
-      <w:r>
-        <w:t xml:space="preserve"> codebase </w:t>
-      </w:r>
-    </w:p>
-    <w:p>
-      <w:r>
-        <w:t xml:space="preserve">• </w:t>
-      </w:r>
-      <w:proofErr w:type="spellStart"/>
-      <w:r>
-        <w:t>bitsandbytes</w:t>
-      </w:r>
-      <w:proofErr w:type="spellEnd"/>
-      <w:r>
-        <w:t xml:space="preserve">, </w:t>
-      </w:r>
-      <w:proofErr w:type="spellStart"/>
-      <w:r>
-        <w:t>AutoGPTQ</w:t>
-      </w:r>
-      <w:proofErr w:type="spellEnd"/>
-      <w:r>
-        <w:t xml:space="preserve"> / AWQ for quantization </w:t>
-      </w:r>
-    </w:p>
-    <w:p>
-      <w:r>
-        <w:t xml:space="preserve">• </w:t>
-      </w:r>
-      <w:proofErr w:type="spellStart"/>
-      <w:r>
-        <w:t>TensorRT</w:t>
-      </w:r>
-      <w:proofErr w:type="spellEnd"/>
-      <w:r>
-        <w:t xml:space="preserve"> (or </w:t>
-      </w:r>
-      <w:proofErr w:type="spellStart"/>
-      <w:r>
-        <w:t>TensorRT</w:t>
-      </w:r>
-      <w:proofErr w:type="spellEnd"/>
-      <w:r>
-        <w:t xml:space="preserve">-LLM) for export/deployment </w:t>
+        <w:t xml:space="preserve">• Python, PyTorch, Hugging Face Transformers </w:t>
+      </w:r>
+    </w:p>
+    <w:p>
+      <w:r>
+        <w:t xml:space="preserve">• OpenVLA codebase </w:t>
+      </w:r>
+    </w:p>
+    <w:p>
+      <w:r>
+        <w:t xml:space="preserve">• bitsandbytes, AutoGPTQ / AWQ for quantization </w:t>
+      </w:r>
+    </w:p>
+    <w:p>
+      <w:r>
+        <w:t xml:space="preserve">• TensorRT (or TensorRT-LLM) for export/deployment </w:t>
       </w:r>
     </w:p>
     <w:p>
@@ -622,7 +575,7 @@
           </w:tcPr>
           <w:p>
             <w:r>
-              <w:t>Group Member 1</w:t>
+              <w:t>Ping</w:t>
             </w:r>
           </w:p>
         </w:tc>
@@ -649,7 +602,7 @@
           </w:tcPr>
           <w:p>
             <w:r>
-              <w:t>Group Member 2</w:t>
+              <w:t>Karthik</w:t>
             </w:r>
           </w:p>
         </w:tc>
@@ -676,7 +629,7 @@
           </w:tcPr>
           <w:p>
             <w:r>
-              <w:t>Group Member 3</w:t>
+              <w:t>Nathan</w:t>
             </w:r>
           </w:p>
         </w:tc>
@@ -685,13 +638,8 @@
             <w:tcW w:w="7401" w:type="dxa"/>
           </w:tcPr>
           <w:p>
-            <w:proofErr w:type="gramStart"/>
-            <w:r>
-              <w:t>Closed-loop</w:t>
-            </w:r>
-            <w:proofErr w:type="gramEnd"/>
-            <w:r>
-              <w:t xml:space="preserve"> wiring between the compressed VLA and the simulator;</w:t>
+            <w:r>
+              <w:t>Closed-loop wiring between the compressed VLA and the simulator;</w:t>
             </w:r>
           </w:p>
           <w:p>
@@ -708,7 +656,7 @@
           </w:tcPr>
           <w:p>
             <w:r>
-              <w:t>Group Member 4</w:t>
+              <w:t>Will</w:t>
             </w:r>
           </w:p>
         </w:tc>
@@ -787,23 +735,7 @@
           </w:tcPr>
           <w:p>
             <w:r>
-              <w:t xml:space="preserve">Study </w:t>
-            </w:r>
-            <w:proofErr w:type="spellStart"/>
-            <w:r>
-              <w:t>OpenVLA</w:t>
-            </w:r>
-            <w:proofErr w:type="spellEnd"/>
-            <w:r>
-              <w:t xml:space="preserve"> architecture and the improved-baseline reference; install Isaac Sim, </w:t>
-            </w:r>
-            <w:proofErr w:type="spellStart"/>
-            <w:r>
-              <w:t>OpenVLA</w:t>
-            </w:r>
-            <w:proofErr w:type="spellEnd"/>
-            <w:r>
-              <w:t xml:space="preserve"> codebase, and compression tooling.</w:t>
+              <w:t>Study OpenVLA architecture and the improved-baseline reference; install Isaac Sim, OpenVLA codebase, and compression tooling.</w:t>
             </w:r>
           </w:p>
         </w:tc>
@@ -825,15 +757,7 @@
           </w:tcPr>
           <w:p>
             <w:r>
-              <w:t xml:space="preserve">uncompressed </w:t>
-            </w:r>
-            <w:proofErr w:type="spellStart"/>
-            <w:r>
-              <w:t>OpenVLA</w:t>
-            </w:r>
-            <w:proofErr w:type="spellEnd"/>
-            <w:r>
-              <w:t xml:space="preserve"> inference baseline (offline); build the Isaac Sim pick-and-place scene and camera setup in parallel.</w:t>
+              <w:t>uncompressed OpenVLA inference baseline (offline); build the Isaac Sim pick-and-place scene and camera setup in parallel.</w:t>
             </w:r>
           </w:p>
         </w:tc>
@@ -870,13 +794,8 @@
             <w:r>
               <w:t xml:space="preserve">Might shift to </w:t>
             </w:r>
-            <w:proofErr w:type="spellStart"/>
-            <w:r>
-              <w:t>LLaVA</w:t>
-            </w:r>
-            <w:proofErr w:type="spellEnd"/>
-            <w:r>
-              <w:t>-VLA</w:t>
+            <w:r>
+              <w:t>LLaVA-VLA</w:t>
             </w:r>
           </w:p>
         </w:tc>
@@ -926,7 +845,6 @@
           </w:p>
           <w:p>
             <w:r>
-              <w:lastRenderedPageBreak/>
               <w:t>Compile the memory</w:t>
             </w:r>
             <w:r>
@@ -964,20 +882,15 @@
       </w:r>
     </w:p>
     <w:p>
-      <w:proofErr w:type="spellStart"/>
-      <w:r>
-        <w:t>OpenVLA</w:t>
-      </w:r>
-      <w:proofErr w:type="spellEnd"/>
-      <w:r>
-        <w:t>: An Open-Source Vision-Language-Action Mode</w:t>
+      <w:r>
+        <w:t>OpenVLA: An Open-Source Vision-Language-Action Mode</w:t>
       </w:r>
       <w:r>
         <w:t>l</w:t>
       </w:r>
     </w:p>
     <w:p>
-      <w:hyperlink r:id="rId6" w:history="1">
+      <w:hyperlink r:id="rId7" w:history="1">
         <w:r>
           <w:rPr>
             <w:rStyle w:val="Hyperlink"/>
@@ -988,15 +901,7 @@
     </w:p>
     <w:p>
       <w:r>
-        <w:t xml:space="preserve">Rethinking the Practicality </w:t>
-      </w:r>
-      <w:proofErr w:type="gramStart"/>
-      <w:r>
-        <w:t>Of</w:t>
-      </w:r>
-      <w:proofErr w:type="gramEnd"/>
-      <w:r>
-        <w:t xml:space="preserve"> Vision-Language-Action Models: A Comprehensive</w:t>
+        <w:t>Rethinking the Practicality Of Vision-Language-Action Models: A Comprehensive</w:t>
       </w:r>
     </w:p>
     <w:p>
@@ -1005,7 +910,7 @@
       </w:r>
     </w:p>
     <w:p>
-      <w:hyperlink r:id="rId7" w:history="1">
+      <w:hyperlink r:id="rId8" w:history="1">
         <w:r>
           <w:rPr>
             <w:rStyle w:val="Hyperlink"/>
@@ -1015,95 +920,37 @@
       </w:hyperlink>
     </w:p>
     <w:p>
-      <w:hyperlink r:id="rId8" w:history="1">
-        <w:r>
-          <w:rPr>
-            <w:rStyle w:val="Hyperlink"/>
-          </w:rPr>
-          <w:t>github.com/</w:t>
-        </w:r>
-        <w:proofErr w:type="spellStart"/>
-        <w:r>
-          <w:rPr>
-            <w:rStyle w:val="Hyperlink"/>
-          </w:rPr>
-          <w:t>OpenHelix</w:t>
-        </w:r>
-        <w:proofErr w:type="spellEnd"/>
-        <w:r>
-          <w:rPr>
-            <w:rStyle w:val="Hyperlink"/>
-          </w:rPr>
-          <w:t>-Team/</w:t>
-        </w:r>
-        <w:proofErr w:type="spellStart"/>
-        <w:r>
-          <w:rPr>
-            <w:rStyle w:val="Hyperlink"/>
-          </w:rPr>
-          <w:t>LLaVA</w:t>
-        </w:r>
-        <w:proofErr w:type="spellEnd"/>
-        <w:r>
-          <w:rPr>
-            <w:rStyle w:val="Hyperlink"/>
-          </w:rPr>
-          <w:t>-VLA</w:t>
-        </w:r>
-      </w:hyperlink>
-    </w:p>
-    <w:p>
-      <w:r>
-        <w:t>NVIDIA Isaac Sim</w:t>
-      </w:r>
-    </w:p>
-    <w:p>
       <w:hyperlink r:id="rId9" w:history="1">
         <w:r>
           <w:rPr>
             <w:rStyle w:val="Hyperlink"/>
           </w:rPr>
-          <w:t>github.com/</w:t>
+          <w:t>github.com/OpenHelix-Team/LLaVA-VLA</w:t>
         </w:r>
-        <w:proofErr w:type="spellStart"/>
+      </w:hyperlink>
+    </w:p>
+    <w:p>
+      <w:r>
+        <w:t>NVIDIA Isaac Sim</w:t>
+      </w:r>
+    </w:p>
+    <w:p>
+      <w:hyperlink r:id="rId10" w:history="1">
         <w:r>
           <w:rPr>
             <w:rStyle w:val="Hyperlink"/>
           </w:rPr>
-          <w:t>isaac</w:t>
+          <w:t>github.com/isaac-sim/IsaacSim</w:t>
         </w:r>
-        <w:proofErr w:type="spellEnd"/>
-        <w:r>
-          <w:rPr>
-            <w:rStyle w:val="Hyperlink"/>
-          </w:rPr>
-          <w:t>-sim/</w:t>
-        </w:r>
-        <w:proofErr w:type="spellStart"/>
-        <w:r>
-          <w:rPr>
-            <w:rStyle w:val="Hyperlink"/>
-          </w:rPr>
-          <w:t>IsaacSim</w:t>
-        </w:r>
-        <w:proofErr w:type="spellEnd"/>
       </w:hyperlink>
     </w:p>
     <w:p>
       <w:r>
-        <w:t xml:space="preserve">NVIDIA — Training Healthcare Robots </w:t>
-      </w:r>
-      <w:proofErr w:type="gramStart"/>
-      <w:r>
-        <w:t>From</w:t>
-      </w:r>
-      <w:proofErr w:type="gramEnd"/>
-      <w:r>
-        <w:t xml:space="preserve"> Scratch: Model Flywheel / Deploy</w:t>
-      </w:r>
-    </w:p>
-    <w:p>
-      <w:hyperlink r:id="rId10" w:history="1">
+        <w:t>NVIDIA — Training Healthcare Robots From Scratch: Model Flywheel / Deploy</w:t>
+      </w:r>
+    </w:p>
+    <w:p>
+      <w:hyperlink r:id="rId11" w:history="1">
         <w:r>
           <w:rPr>
             <w:rStyle w:val="Hyperlink"/>
@@ -1121,6 +968,243 @@
     </w:sectPr>
   </w:body>
 </w:document>
+</file>
+
+<file path=word/numbering.xml><?xml version="1.0" encoding="utf-8"?>
+<w:numbering xmlns:wpc="http://schemas.microsoft.com/office/word/2010/wordprocessingCanvas" xmlns:cx="http://schemas.microsoft.com/office/drawing/2014/chartex" xmlns:cx1="http://schemas.microsoft.com/office/drawing/2015/9/8/chartex" xmlns:cx2="http://schemas.microsoft.com/office/drawing/2015/10/21/chartex" xmlns:cx3="http://schemas.microsoft.com/office/drawing/2016/5/9/chartex" xmlns:cx4="http://schemas.microsoft.com/office/drawing/2016/5/10/chartex" xmlns:cx5="http://schemas.microsoft.com/office/drawing/2016/5/11/chartex" xmlns:cx6="http://schemas.microsoft.com/office/drawing/2016/5/12/chartex" xmlns:cx7="http://schemas.microsoft.com/office/drawing/2016/5/13/chartex" xmlns:cx8="http://schemas.microsoft.com/office/drawing/2016/5/14/chartex" xmlns:mc="http://schemas.openxmlformats.org/markup-compatibility/2006" xmlns:aink="http://schemas.microsoft.com/office/drawing/2016/ink" xmlns:am3d="http://schemas.microsoft.com/office/drawing/2017/model3d" xmlns:o="urn:schemas-microsoft-com:office:office" xmlns:oel="http://schemas.microsoft.com/office/2019/extlst" xmlns:r="http://schemas.openxmlformats.org/officeDocument/2006/relationships" xmlns:m="http://schemas.openxmlformats.org/officeDocument/2006/math" xmlns:v="urn:schemas-microsoft-com:vml" xmlns:wp14="http://schemas.microsoft.com/office/word/2010/wordprocessingDrawing" xmlns:wp="http://schemas.openxmlformats.org/drawingml/2006/wordprocessingDrawing" xmlns:w10="urn:schemas-microsoft-com:office:word" xmlns:w="http://schemas.openxmlformats.org/wordprocessingml/2006/main" xmlns:w14="http://schemas.microsoft.com/office/word/2010/wordml" xmlns:w15="http://schemas.microsoft.com/office/word/2012/wordml" xmlns:w16cex="http://schemas.microsoft.com/office/word/2018/wordml/cex" xmlns:w16cid="http://schemas.microsoft.com/office/word/2016/wordml/cid" xmlns:w16="http://schemas.microsoft.com/office/word/2018/wordml" xmlns:w16du="http://schemas.microsoft.com/office/word/2023/wordml/word16du" xmlns:w16sdtdh="http://schemas.microsoft.com/office/word/2020/wordml/sdtdatahash" xmlns:w16sdtfl="http://schemas.microsoft.com/office/word/2024/wordml/sdtformatlock" xmlns:w16se="http://schemas.microsoft.com/office/word/2015/wordml/symex" xmlns:wpg="http://schemas.microsoft.com/office/word/2010/wordprocessingGroup" xmlns:wpi="http://schemas.microsoft.com/office/word/2010/wordprocessingInk" xmlns:wne="http://schemas.microsoft.com/office/word/2006/wordml" xmlns:wps="http://schemas.microsoft.com/office/word/2010/wordprocessingShape" mc:Ignorable="w14 w15 w16se w16cid w16 w16cex w16sdtdh w16sdtfl w16du wp14">
+  <w:abstractNum w:abstractNumId="0" w15:restartNumberingAfterBreak="0">
+    <w:nsid w:val="3A935434"/>
+    <w:multiLevelType w:val="hybridMultilevel"/>
+    <w:tmpl w:val="2E84DEF0"/>
+    <w:lvl w:ilvl="0" w:tplc="40090001">
+      <w:start w:val="1"/>
+      <w:numFmt w:val="bullet"/>
+      <w:lvlText w:val=""/>
+      <w:lvlJc w:val="left"/>
+      <w:pPr>
+        <w:ind w:left="720" w:hanging="360"/>
+      </w:pPr>
+      <w:rPr>
+        <w:rFonts w:ascii="Symbol" w:hAnsi="Symbol" w:hint="default"/>
+      </w:rPr>
+    </w:lvl>
+    <w:lvl w:ilvl="1" w:tplc="40090003" w:tentative="1">
+      <w:start w:val="1"/>
+      <w:numFmt w:val="bullet"/>
+      <w:lvlText w:val="o"/>
+      <w:lvlJc w:val="left"/>
+      <w:pPr>
+        <w:ind w:left="1440" w:hanging="360"/>
+      </w:pPr>
+      <w:rPr>
+        <w:rFonts w:ascii="Courier New" w:hAnsi="Courier New" w:cs="Courier New" w:hint="default"/>
+      </w:rPr>
+    </w:lvl>
+    <w:lvl w:ilvl="2" w:tplc="40090005" w:tentative="1">
+      <w:start w:val="1"/>
+      <w:numFmt w:val="bullet"/>
+      <w:lvlText w:val=""/>
+      <w:lvlJc w:val="left"/>
+      <w:pPr>
+        <w:ind w:left="2160" w:hanging="360"/>
+      </w:pPr>
+      <w:rPr>
+        <w:rFonts w:ascii="Wingdings" w:hAnsi="Wingdings" w:hint="default"/>
+      </w:rPr>
+    </w:lvl>
+    <w:lvl w:ilvl="3" w:tplc="40090001" w:tentative="1">
+      <w:start w:val="1"/>
+      <w:numFmt w:val="bullet"/>
+      <w:lvlText w:val=""/>
+      <w:lvlJc w:val="left"/>
+      <w:pPr>
+        <w:ind w:left="2880" w:hanging="360"/>
+      </w:pPr>
+      <w:rPr>
+        <w:rFonts w:ascii="Symbol" w:hAnsi="Symbol" w:hint="default"/>
+      </w:rPr>
+    </w:lvl>
+    <w:lvl w:ilvl="4" w:tplc="40090003" w:tentative="1">
+      <w:start w:val="1"/>
+      <w:numFmt w:val="bullet"/>
+      <w:lvlText w:val="o"/>
+      <w:lvlJc w:val="left"/>
+      <w:pPr>
+        <w:ind w:left="3600" w:hanging="360"/>
+      </w:pPr>
+      <w:rPr>
+        <w:rFonts w:ascii="Courier New" w:hAnsi="Courier New" w:cs="Courier New" w:hint="default"/>
+      </w:rPr>
+    </w:lvl>
+    <w:lvl w:ilvl="5" w:tplc="40090005" w:tentative="1">
+      <w:start w:val="1"/>
+      <w:numFmt w:val="bullet"/>
+      <w:lvlText w:val=""/>
+      <w:lvlJc w:val="left"/>
+      <w:pPr>
+        <w:ind w:left="4320" w:hanging="360"/>
+      </w:pPr>
+      <w:rPr>
+        <w:rFonts w:ascii="Wingdings" w:hAnsi="Wingdings" w:hint="default"/>
+      </w:rPr>
+    </w:lvl>
+    <w:lvl w:ilvl="6" w:tplc="40090001" w:tentative="1">
+      <w:start w:val="1"/>
+      <w:numFmt w:val="bullet"/>
+      <w:lvlText w:val=""/>
+      <w:lvlJc w:val="left"/>
+      <w:pPr>
+        <w:ind w:left="5040" w:hanging="360"/>
+      </w:pPr>
+      <w:rPr>
+        <w:rFonts w:ascii="Symbol" w:hAnsi="Symbol" w:hint="default"/>
+      </w:rPr>
+    </w:lvl>
+    <w:lvl w:ilvl="7" w:tplc="40090003" w:tentative="1">
+      <w:start w:val="1"/>
+      <w:numFmt w:val="bullet"/>
+      <w:lvlText w:val="o"/>
+      <w:lvlJc w:val="left"/>
+      <w:pPr>
+        <w:ind w:left="5760" w:hanging="360"/>
+      </w:pPr>
+      <w:rPr>
+        <w:rFonts w:ascii="Courier New" w:hAnsi="Courier New" w:cs="Courier New" w:hint="default"/>
+      </w:rPr>
+    </w:lvl>
+    <w:lvl w:ilvl="8" w:tplc="40090005" w:tentative="1">
+      <w:start w:val="1"/>
+      <w:numFmt w:val="bullet"/>
+      <w:lvlText w:val=""/>
+      <w:lvlJc w:val="left"/>
+      <w:pPr>
+        <w:ind w:left="6480" w:hanging="360"/>
+      </w:pPr>
+      <w:rPr>
+        <w:rFonts w:ascii="Wingdings" w:hAnsi="Wingdings" w:hint="default"/>
+      </w:rPr>
+    </w:lvl>
+  </w:abstractNum>
+  <w:abstractNum w:abstractNumId="1" w15:restartNumberingAfterBreak="0">
+    <w:nsid w:val="7F8A15FF"/>
+    <w:multiLevelType w:val="hybridMultilevel"/>
+    <w:tmpl w:val="37D8C594"/>
+    <w:lvl w:ilvl="0" w:tplc="40090001">
+      <w:start w:val="1"/>
+      <w:numFmt w:val="bullet"/>
+      <w:lvlText w:val=""/>
+      <w:lvlJc w:val="left"/>
+      <w:pPr>
+        <w:ind w:left="720" w:hanging="360"/>
+      </w:pPr>
+      <w:rPr>
+        <w:rFonts w:ascii="Symbol" w:hAnsi="Symbol" w:hint="default"/>
+      </w:rPr>
+    </w:lvl>
+    <w:lvl w:ilvl="1" w:tplc="40090003" w:tentative="1">
+      <w:start w:val="1"/>
+      <w:numFmt w:val="bullet"/>
+      <w:lvlText w:val="o"/>
+      <w:lvlJc w:val="left"/>
+      <w:pPr>
+        <w:ind w:left="1440" w:hanging="360"/>
+      </w:pPr>
+      <w:rPr>
+        <w:rFonts w:ascii="Courier New" w:hAnsi="Courier New" w:cs="Courier New" w:hint="default"/>
+      </w:rPr>
+    </w:lvl>
+    <w:lvl w:ilvl="2" w:tplc="40090005" w:tentative="1">
+      <w:start w:val="1"/>
+      <w:numFmt w:val="bullet"/>
+      <w:lvlText w:val=""/>
+      <w:lvlJc w:val="left"/>
+      <w:pPr>
+        <w:ind w:left="2160" w:hanging="360"/>
+      </w:pPr>
+      <w:rPr>
+        <w:rFonts w:ascii="Wingdings" w:hAnsi="Wingdings" w:hint="default"/>
+      </w:rPr>
+    </w:lvl>
+    <w:lvl w:ilvl="3" w:tplc="40090001" w:tentative="1">
+      <w:start w:val="1"/>
+      <w:numFmt w:val="bullet"/>
+      <w:lvlText w:val=""/>
+      <w:lvlJc w:val="left"/>
+      <w:pPr>
+        <w:ind w:left="2880" w:hanging="360"/>
+      </w:pPr>
+      <w:rPr>
+        <w:rFonts w:ascii="Symbol" w:hAnsi="Symbol" w:hint="default"/>
+      </w:rPr>
+    </w:lvl>
+    <w:lvl w:ilvl="4" w:tplc="40090003" w:tentative="1">
+      <w:start w:val="1"/>
+      <w:numFmt w:val="bullet"/>
+      <w:lvlText w:val="o"/>
+      <w:lvlJc w:val="left"/>
+      <w:pPr>
+        <w:ind w:left="3600" w:hanging="360"/>
+      </w:pPr>
+      <w:rPr>
+        <w:rFonts w:ascii="Courier New" w:hAnsi="Courier New" w:cs="Courier New" w:hint="default"/>
+      </w:rPr>
+    </w:lvl>
+    <w:lvl w:ilvl="5" w:tplc="40090005" w:tentative="1">
+      <w:start w:val="1"/>
+      <w:numFmt w:val="bullet"/>
+      <w:lvlText w:val=""/>
+      <w:lvlJc w:val="left"/>
+      <w:pPr>
+        <w:ind w:left="4320" w:hanging="360"/>
+      </w:pPr>
+      <w:rPr>
+        <w:rFonts w:ascii="Wingdings" w:hAnsi="Wingdings" w:hint="default"/>
+      </w:rPr>
+    </w:lvl>
+    <w:lvl w:ilvl="6" w:tplc="40090001" w:tentative="1">
+      <w:start w:val="1"/>
+      <w:numFmt w:val="bullet"/>
+      <w:lvlText w:val=""/>
+      <w:lvlJc w:val="left"/>
+      <w:pPr>
+        <w:ind w:left="5040" w:hanging="360"/>
+      </w:pPr>
+      <w:rPr>
+        <w:rFonts w:ascii="Symbol" w:hAnsi="Symbol" w:hint="default"/>
+      </w:rPr>
+    </w:lvl>
+    <w:lvl w:ilvl="7" w:tplc="40090003" w:tentative="1">
+      <w:start w:val="1"/>
+      <w:numFmt w:val="bullet"/>
+      <w:lvlText w:val="o"/>
+      <w:lvlJc w:val="left"/>
+      <w:pPr>
+        <w:ind w:left="5760" w:hanging="360"/>
+      </w:pPr>
+      <w:rPr>
+        <w:rFonts w:ascii="Courier New" w:hAnsi="Courier New" w:cs="Courier New" w:hint="default"/>
+      </w:rPr>
+    </w:lvl>
+    <w:lvl w:ilvl="8" w:tplc="40090005" w:tentative="1">
+      <w:start w:val="1"/>
+      <w:numFmt w:val="bullet"/>
+      <w:lvlText w:val=""/>
+      <w:lvlJc w:val="left"/>
+      <w:pPr>
+        <w:ind w:left="6480" w:hanging="360"/>
+      </w:pPr>
+      <w:rPr>
+        <w:rFonts w:ascii="Wingdings" w:hAnsi="Wingdings" w:hint="default"/>
+      </w:rPr>
+    </w:lvl>
+  </w:abstractNum>
+  <w:num w:numId="1" w16cid:durableId="1227184181">
+    <w:abstractNumId w:val="0"/>
+  </w:num>
+  <w:num w:numId="2" w16cid:durableId="1555698281">
+    <w:abstractNumId w:val="1"/>
+  </w:num>
+</w:numbering>
 </file>
 
 <file path=word/styles.xml><?xml version="1.0" encoding="utf-8"?>
@@ -1726,7 +1810,6 @@
   <w:style w:type="character" w:default="1" w:styleId="DefaultParagraphFont">
     <w:name w:val="Default Paragraph Font"/>
     <w:uiPriority w:val="1"/>
-    <w:semiHidden/>
     <w:unhideWhenUsed/>
   </w:style>
   <w:style w:type="table" w:default="1" w:styleId="TableNormal">

</xml_diff>